<commit_message>
Add create-account and forgot-password flows; update report for live alerts and sign-up
Login page gains Cognito sign-up with email code verification, resend code, and password reset by emailed code. Labels now wrap their inputs. Report Section 9 now covers the deployed Lambda, SNS and CloudWatch alert pipeline and self-service sign-up.
</commit_message>
<xml_diff>
--- a/docs/AURA_Project_Review_Final.docx
+++ b/docs/AURA_Project_Review_Final.docx
@@ -378,7 +378,7 @@
       <w:r>
         <w:fldChar w:fldCharType="separate"/>
       </w:r>
-      <w:hyperlink w:anchor="_Toc243606554" w:history="1">
+      <w:hyperlink w:anchor="_Toc243765033" w:history="1">
         <w:r>
           <w:rPr>
             <w:rStyle w:val="Hyperlink"/>
@@ -405,7 +405,7 @@
             <w:noProof/>
             <w:webHidden/>
           </w:rPr>
-          <w:instrText xml:space="preserve"> PAGEREF _Toc243606554 \h </w:instrText>
+          <w:instrText xml:space="preserve"> PAGEREF _Toc243765033 \h </w:instrText>
         </w:r>
         <w:r>
           <w:rPr>
@@ -452,7 +452,7 @@
           <w14:ligatures w14:val="standardContextual"/>
         </w:rPr>
       </w:pPr>
-      <w:hyperlink w:anchor="_Toc243606555" w:history="1">
+      <w:hyperlink w:anchor="_Toc243765034" w:history="1">
         <w:r>
           <w:rPr>
             <w:rStyle w:val="Hyperlink"/>
@@ -479,7 +479,7 @@
             <w:noProof/>
             <w:webHidden/>
           </w:rPr>
-          <w:instrText xml:space="preserve"> PAGEREF _Toc243606555 \h </w:instrText>
+          <w:instrText xml:space="preserve"> PAGEREF _Toc243765034 \h </w:instrText>
         </w:r>
         <w:r>
           <w:rPr>
@@ -526,7 +526,7 @@
           <w14:ligatures w14:val="standardContextual"/>
         </w:rPr>
       </w:pPr>
-      <w:hyperlink w:anchor="_Toc243606556" w:history="1">
+      <w:hyperlink w:anchor="_Toc243765035" w:history="1">
         <w:r>
           <w:rPr>
             <w:rStyle w:val="Hyperlink"/>
@@ -553,7 +553,7 @@
             <w:noProof/>
             <w:webHidden/>
           </w:rPr>
-          <w:instrText xml:space="preserve"> PAGEREF _Toc243606556 \h </w:instrText>
+          <w:instrText xml:space="preserve"> PAGEREF _Toc243765035 \h </w:instrText>
         </w:r>
         <w:r>
           <w:rPr>
@@ -600,7 +600,7 @@
           <w14:ligatures w14:val="standardContextual"/>
         </w:rPr>
       </w:pPr>
-      <w:hyperlink w:anchor="_Toc243606557" w:history="1">
+      <w:hyperlink w:anchor="_Toc243765036" w:history="1">
         <w:r>
           <w:rPr>
             <w:rStyle w:val="Hyperlink"/>
@@ -627,7 +627,7 @@
             <w:noProof/>
             <w:webHidden/>
           </w:rPr>
-          <w:instrText xml:space="preserve"> PAGEREF _Toc243606557 \h </w:instrText>
+          <w:instrText xml:space="preserve"> PAGEREF _Toc243765036 \h </w:instrText>
         </w:r>
         <w:r>
           <w:rPr>
@@ -674,7 +674,7 @@
           <w14:ligatures w14:val="standardContextual"/>
         </w:rPr>
       </w:pPr>
-      <w:hyperlink w:anchor="_Toc243606558" w:history="1">
+      <w:hyperlink w:anchor="_Toc243765037" w:history="1">
         <w:r>
           <w:rPr>
             <w:rStyle w:val="Hyperlink"/>
@@ -701,7 +701,7 @@
             <w:noProof/>
             <w:webHidden/>
           </w:rPr>
-          <w:instrText xml:space="preserve"> PAGEREF _Toc243606558 \h </w:instrText>
+          <w:instrText xml:space="preserve"> PAGEREF _Toc243765037 \h </w:instrText>
         </w:r>
         <w:r>
           <w:rPr>
@@ -748,7 +748,7 @@
           <w14:ligatures w14:val="standardContextual"/>
         </w:rPr>
       </w:pPr>
-      <w:hyperlink w:anchor="_Toc243606559" w:history="1">
+      <w:hyperlink w:anchor="_Toc243765038" w:history="1">
         <w:r>
           <w:rPr>
             <w:rStyle w:val="Hyperlink"/>
@@ -775,7 +775,7 @@
             <w:noProof/>
             <w:webHidden/>
           </w:rPr>
-          <w:instrText xml:space="preserve"> PAGEREF _Toc243606559 \h </w:instrText>
+          <w:instrText xml:space="preserve"> PAGEREF _Toc243765038 \h </w:instrText>
         </w:r>
         <w:r>
           <w:rPr>
@@ -822,7 +822,7 @@
           <w14:ligatures w14:val="standardContextual"/>
         </w:rPr>
       </w:pPr>
-      <w:hyperlink w:anchor="_Toc243606560" w:history="1">
+      <w:hyperlink w:anchor="_Toc243765039" w:history="1">
         <w:r>
           <w:rPr>
             <w:rStyle w:val="Hyperlink"/>
@@ -849,7 +849,7 @@
             <w:noProof/>
             <w:webHidden/>
           </w:rPr>
-          <w:instrText xml:space="preserve"> PAGEREF _Toc243606560 \h </w:instrText>
+          <w:instrText xml:space="preserve"> PAGEREF _Toc243765039 \h </w:instrText>
         </w:r>
         <w:r>
           <w:rPr>
@@ -896,7 +896,7 @@
           <w14:ligatures w14:val="standardContextual"/>
         </w:rPr>
       </w:pPr>
-      <w:hyperlink w:anchor="_Toc243606561" w:history="1">
+      <w:hyperlink w:anchor="_Toc243765040" w:history="1">
         <w:r>
           <w:rPr>
             <w:rStyle w:val="Hyperlink"/>
@@ -923,7 +923,7 @@
             <w:noProof/>
             <w:webHidden/>
           </w:rPr>
-          <w:instrText xml:space="preserve"> PAGEREF _Toc243606561 \h </w:instrText>
+          <w:instrText xml:space="preserve"> PAGEREF _Toc243765040 \h </w:instrText>
         </w:r>
         <w:r>
           <w:rPr>
@@ -970,7 +970,7 @@
           <w14:ligatures w14:val="standardContextual"/>
         </w:rPr>
       </w:pPr>
-      <w:hyperlink w:anchor="_Toc243606562" w:history="1">
+      <w:hyperlink w:anchor="_Toc243765041" w:history="1">
         <w:r>
           <w:rPr>
             <w:rStyle w:val="Hyperlink"/>
@@ -997,7 +997,7 @@
             <w:noProof/>
             <w:webHidden/>
           </w:rPr>
-          <w:instrText xml:space="preserve"> PAGEREF _Toc243606562 \h </w:instrText>
+          <w:instrText xml:space="preserve"> PAGEREF _Toc243765041 \h </w:instrText>
         </w:r>
         <w:r>
           <w:rPr>
@@ -1044,7 +1044,7 @@
           <w14:ligatures w14:val="standardContextual"/>
         </w:rPr>
       </w:pPr>
-      <w:hyperlink w:anchor="_Toc243606563" w:history="1">
+      <w:hyperlink w:anchor="_Toc243765042" w:history="1">
         <w:r>
           <w:rPr>
             <w:rStyle w:val="Hyperlink"/>
@@ -1071,7 +1071,7 @@
             <w:noProof/>
             <w:webHidden/>
           </w:rPr>
-          <w:instrText xml:space="preserve"> PAGEREF _Toc243606563 \h </w:instrText>
+          <w:instrText xml:space="preserve"> PAGEREF _Toc243765042 \h </w:instrText>
         </w:r>
         <w:r>
           <w:rPr>
@@ -1118,7 +1118,7 @@
           <w14:ligatures w14:val="standardContextual"/>
         </w:rPr>
       </w:pPr>
-      <w:hyperlink w:anchor="_Toc243606564" w:history="1">
+      <w:hyperlink w:anchor="_Toc243765043" w:history="1">
         <w:r>
           <w:rPr>
             <w:rStyle w:val="Hyperlink"/>
@@ -1145,7 +1145,7 @@
             <w:noProof/>
             <w:webHidden/>
           </w:rPr>
-          <w:instrText xml:space="preserve"> PAGEREF _Toc243606564 \h </w:instrText>
+          <w:instrText xml:space="preserve"> PAGEREF _Toc243765043 \h </w:instrText>
         </w:r>
         <w:r>
           <w:rPr>
@@ -1192,7 +1192,7 @@
           <w14:ligatures w14:val="standardContextual"/>
         </w:rPr>
       </w:pPr>
-      <w:hyperlink w:anchor="_Toc243606565" w:history="1">
+      <w:hyperlink w:anchor="_Toc243765044" w:history="1">
         <w:r>
           <w:rPr>
             <w:rStyle w:val="Hyperlink"/>
@@ -1219,7 +1219,7 @@
             <w:noProof/>
             <w:webHidden/>
           </w:rPr>
-          <w:instrText xml:space="preserve"> PAGEREF _Toc243606565 \h </w:instrText>
+          <w:instrText xml:space="preserve"> PAGEREF _Toc243765044 \h </w:instrText>
         </w:r>
         <w:r>
           <w:rPr>
@@ -1266,7 +1266,7 @@
           <w14:ligatures w14:val="standardContextual"/>
         </w:rPr>
       </w:pPr>
-      <w:hyperlink w:anchor="_Toc243606566" w:history="1">
+      <w:hyperlink w:anchor="_Toc243765045" w:history="1">
         <w:r>
           <w:rPr>
             <w:rStyle w:val="Hyperlink"/>
@@ -1293,7 +1293,7 @@
             <w:noProof/>
             <w:webHidden/>
           </w:rPr>
-          <w:instrText xml:space="preserve"> PAGEREF _Toc243606566 \h </w:instrText>
+          <w:instrText xml:space="preserve"> PAGEREF _Toc243765045 \h </w:instrText>
         </w:r>
         <w:r>
           <w:rPr>
@@ -1340,7 +1340,7 @@
           <w14:ligatures w14:val="standardContextual"/>
         </w:rPr>
       </w:pPr>
-      <w:hyperlink w:anchor="_Toc243606567" w:history="1">
+      <w:hyperlink w:anchor="_Toc243765046" w:history="1">
         <w:r>
           <w:rPr>
             <w:rStyle w:val="Hyperlink"/>
@@ -1367,7 +1367,7 @@
             <w:noProof/>
             <w:webHidden/>
           </w:rPr>
-          <w:instrText xml:space="preserve"> PAGEREF _Toc243606567 \h </w:instrText>
+          <w:instrText xml:space="preserve"> PAGEREF _Toc243765046 \h </w:instrText>
         </w:r>
         <w:r>
           <w:rPr>
@@ -1414,7 +1414,7 @@
           <w14:ligatures w14:val="standardContextual"/>
         </w:rPr>
       </w:pPr>
-      <w:hyperlink w:anchor="_Toc243606568" w:history="1">
+      <w:hyperlink w:anchor="_Toc243765047" w:history="1">
         <w:r>
           <w:rPr>
             <w:rStyle w:val="Hyperlink"/>
@@ -1441,7 +1441,7 @@
             <w:noProof/>
             <w:webHidden/>
           </w:rPr>
-          <w:instrText xml:space="preserve"> PAGEREF _Toc243606568 \h </w:instrText>
+          <w:instrText xml:space="preserve"> PAGEREF _Toc243765047 \h </w:instrText>
         </w:r>
         <w:r>
           <w:rPr>
@@ -1488,7 +1488,7 @@
           <w14:ligatures w14:val="standardContextual"/>
         </w:rPr>
       </w:pPr>
-      <w:hyperlink w:anchor="_Toc243606569" w:history="1">
+      <w:hyperlink w:anchor="_Toc243765048" w:history="1">
         <w:r>
           <w:rPr>
             <w:rStyle w:val="Hyperlink"/>
@@ -1515,7 +1515,7 @@
             <w:noProof/>
             <w:webHidden/>
           </w:rPr>
-          <w:instrText xml:space="preserve"> PAGEREF _Toc243606569 \h </w:instrText>
+          <w:instrText xml:space="preserve"> PAGEREF _Toc243765048 \h </w:instrText>
         </w:r>
         <w:r>
           <w:rPr>
@@ -1562,7 +1562,7 @@
           <w14:ligatures w14:val="standardContextual"/>
         </w:rPr>
       </w:pPr>
-      <w:hyperlink w:anchor="_Toc243606570" w:history="1">
+      <w:hyperlink w:anchor="_Toc243765049" w:history="1">
         <w:r>
           <w:rPr>
             <w:rStyle w:val="Hyperlink"/>
@@ -1589,7 +1589,7 @@
             <w:noProof/>
             <w:webHidden/>
           </w:rPr>
-          <w:instrText xml:space="preserve"> PAGEREF _Toc243606570 \h </w:instrText>
+          <w:instrText xml:space="preserve"> PAGEREF _Toc243765049 \h </w:instrText>
         </w:r>
         <w:r>
           <w:rPr>
@@ -1636,7 +1636,7 @@
           <w14:ligatures w14:val="standardContextual"/>
         </w:rPr>
       </w:pPr>
-      <w:hyperlink w:anchor="_Toc243606571" w:history="1">
+      <w:hyperlink w:anchor="_Toc243765050" w:history="1">
         <w:r>
           <w:rPr>
             <w:rStyle w:val="Hyperlink"/>
@@ -1663,7 +1663,7 @@
             <w:noProof/>
             <w:webHidden/>
           </w:rPr>
-          <w:instrText xml:space="preserve"> PAGEREF _Toc243606571 \h </w:instrText>
+          <w:instrText xml:space="preserve"> PAGEREF _Toc243765050 \h </w:instrText>
         </w:r>
         <w:r>
           <w:rPr>
@@ -1710,7 +1710,7 @@
           <w14:ligatures w14:val="standardContextual"/>
         </w:rPr>
       </w:pPr>
-      <w:hyperlink w:anchor="_Toc243606572" w:history="1">
+      <w:hyperlink w:anchor="_Toc243765051" w:history="1">
         <w:r>
           <w:rPr>
             <w:rStyle w:val="Hyperlink"/>
@@ -1737,7 +1737,7 @@
             <w:noProof/>
             <w:webHidden/>
           </w:rPr>
-          <w:instrText xml:space="preserve"> PAGEREF _Toc243606572 \h </w:instrText>
+          <w:instrText xml:space="preserve"> PAGEREF _Toc243765051 \h </w:instrText>
         </w:r>
         <w:r>
           <w:rPr>
@@ -1782,7 +1782,7 @@
       <w:pPr>
         <w:pStyle w:val="Heading1"/>
       </w:pPr>
-      <w:bookmarkStart w:id="0" w:name="_Toc243606554"/>
+      <w:bookmarkStart w:id="0" w:name="_Toc243765033"/>
       <w:r>
         <w:lastRenderedPageBreak/>
         <w:t>Abstract</w:t>
@@ -1799,10 +1799,10 @@
     </w:p>
     <w:p>
       <w:r>
-        <w:t xml:space="preserve">We trained and tested the system on real metered data from the CU-BEMS building at Chulalongkorn University in Bangkok, using a strict train/validation/test split. On the held-out test period (12 August to 21 October 2019), the LSTM's mean absolute error (MAE) was 35.9 kW, 20% lower than a same-hour-last-week baseline. AURA is a full-stack application: a React dashboard, a Node.js/Express API, and a Python forecasting engine. It is deployed on AWS using EC2, S3, Cognito, DynamoDB and IAM, and the dashboard </w:t>
-      </w:r>
-      <w:r>
-        <w:t>includes an interactive simulator, CSV upload, anomaly detection and carbon advice.</w:t>
+        <w:t>We trained and tested the system on real metered data from the CU-BEMS building at Chulalongkorn University in Bangkok, using a strict train/validation/test split. On the held-out test period (12 August to 21 October 2019), the LSTM's mean absolute error (MAE) was 35.9 kW, 20% lower than a same-hour-last-week baseline. AURA is a full-stack application: a React dashboard, a Node.js/Express API, and a Python forecasting engine. It is deployed on AWS using EC2, S3, Cognito, DynamoDB, IAM, Lambda, SNS and Cloud</w:t>
+      </w:r>
+      <w:r>
+        <w:t>Watch, and the dashboard includes an interactive simulator, CSV upload, anomaly detection and carbon advice.</w:t>
       </w:r>
     </w:p>
     <w:p>
@@ -1814,7 +1814,7 @@
       <w:pPr>
         <w:pStyle w:val="Heading1"/>
       </w:pPr>
-      <w:bookmarkStart w:id="1" w:name="_Toc243606555"/>
+      <w:bookmarkStart w:id="1" w:name="_Toc243765034"/>
       <w:r>
         <w:lastRenderedPageBreak/>
         <w:t>1. Introduction</w:t>
@@ -1845,7 +1845,7 @@
       <w:pPr>
         <w:pStyle w:val="Heading1"/>
       </w:pPr>
-      <w:bookmarkStart w:id="2" w:name="_Toc243606556"/>
+      <w:bookmarkStart w:id="2" w:name="_Toc243765035"/>
       <w:r>
         <w:t>2. Problem Statement and Objectives</w:t>
       </w:r>
@@ -2266,7 +2266,7 @@
               <w:rPr>
                 <w:sz w:val="19"/>
               </w:rPr>
-              <w:t>EC2 + S3 + Cognito + DynamoDB</w:t>
+              <w:t>8 AWS services live: EC2, S3, Cognito, DynamoDB, IAM, Lambda, SNS, CloudWatch</w:t>
             </w:r>
           </w:p>
         </w:tc>
@@ -2277,9 +2277,8 @@
       <w:pPr>
         <w:pStyle w:val="Heading1"/>
       </w:pPr>
-      <w:bookmarkStart w:id="3" w:name="_Toc243606557"/>
-      <w:r>
-        <w:lastRenderedPageBreak/>
+      <w:bookmarkStart w:id="3" w:name="_Toc243765036"/>
+      <w:r>
         <w:t>3. Related Work and Project Contribution</w:t>
       </w:r>
       <w:bookmarkEnd w:id="3"/>
@@ -2603,7 +2602,7 @@
       <w:pPr>
         <w:pStyle w:val="Heading1"/>
       </w:pPr>
-      <w:bookmarkStart w:id="4" w:name="_Toc243606558"/>
+      <w:bookmarkStart w:id="4" w:name="_Toc243765037"/>
       <w:r>
         <w:t>4. System Architecture</w:t>
       </w:r>
@@ -2622,8 +2621,9 @@
         <w:rPr>
           <w:noProof/>
         </w:rPr>
+        <w:lastRenderedPageBreak/>
         <w:drawing>
-          <wp:inline distT="0" distB="0" distL="0" distR="0" wp14:anchorId="6944258A" wp14:editId="7660FE24">
+          <wp:inline distT="0" distB="0" distL="0" distR="0" wp14:anchorId="06DA1C59" wp14:editId="787E2924">
             <wp:extent cx="5760000" cy="1530109"/>
             <wp:effectExtent l="0" t="0" r="0" b="0"/>
             <wp:docPr id="1" name="Picture 1"/>
@@ -2702,7 +2702,6 @@
                 <w:color w:val="FFFFFF"/>
                 <w:sz w:val="19"/>
               </w:rPr>
-              <w:lastRenderedPageBreak/>
               <w:t>Layer</w:t>
             </w:r>
           </w:p>
@@ -2986,7 +2985,7 @@
           <w:noProof/>
         </w:rPr>
         <w:drawing>
-          <wp:inline distT="0" distB="0" distL="0" distR="0" wp14:anchorId="02029136" wp14:editId="378967E9">
+          <wp:inline distT="0" distB="0" distL="0" distR="0" wp14:anchorId="1AFD4DBB" wp14:editId="029BB7F5">
             <wp:extent cx="5760000" cy="1518374"/>
             <wp:effectExtent l="0" t="0" r="0" b="0"/>
             <wp:docPr id="2" name="Picture 2"/>
@@ -3038,7 +3037,7 @@
       <w:pPr>
         <w:pStyle w:val="Heading1"/>
       </w:pPr>
-      <w:bookmarkStart w:id="5" w:name="_Toc243606559"/>
+      <w:bookmarkStart w:id="5" w:name="_Toc243765038"/>
       <w:r>
         <w:t>5. Dataset and Preprocessing</w:t>
       </w:r>
@@ -3309,6 +3308,7 @@
               <w:rPr>
                 <w:sz w:val="19"/>
               </w:rPr>
+              <w:lastRenderedPageBreak/>
               <w:t>Carbon data</w:t>
             </w:r>
           </w:p>
@@ -3373,7 +3373,6 @@
         <w:pStyle w:val="ListNumber"/>
       </w:pPr>
       <w:r>
-        <w:lastRenderedPageBreak/>
         <w:t>Resample to 15-minute means and interpolate gaps of up to 1 hour; longer gaps stay empty.</w:t>
       </w:r>
     </w:p>
@@ -3654,7 +3653,7 @@
       <w:pPr>
         <w:pStyle w:val="Heading1"/>
       </w:pPr>
-      <w:bookmarkStart w:id="6" w:name="_Toc243606560"/>
+      <w:bookmarkStart w:id="6" w:name="_Toc243765039"/>
       <w:r>
         <w:t>6. Demand Forecasting Model</w:t>
       </w:r>
@@ -3991,6 +3990,7 @@
         <w:rPr>
           <w:b/>
         </w:rPr>
+        <w:lastRenderedPageBreak/>
         <w:t>What we learned.</w:t>
       </w:r>
       <w:r>
@@ -4005,9 +4005,8 @@
         <w:rPr>
           <w:noProof/>
         </w:rPr>
-        <w:lastRenderedPageBreak/>
         <w:drawing>
-          <wp:inline distT="0" distB="0" distL="0" distR="0" wp14:anchorId="2D641E54" wp14:editId="74EC4E56">
+          <wp:inline distT="0" distB="0" distL="0" distR="0" wp14:anchorId="2AECEE3F" wp14:editId="5E7CC23A">
             <wp:extent cx="5760000" cy="3840000"/>
             <wp:effectExtent l="0" t="0" r="0" b="0"/>
             <wp:docPr id="3" name="Picture 3"/>
@@ -4059,7 +4058,7 @@
       <w:pPr>
         <w:pStyle w:val="Heading1"/>
       </w:pPr>
-      <w:bookmarkStart w:id="7" w:name="_Toc243606561"/>
+      <w:bookmarkStart w:id="7" w:name="_Toc243765040"/>
       <w:r>
         <w:t>7. Forecast-Driven, Carbon-Aware Allocation Simulation</w:t>
       </w:r>
@@ -4429,6 +4428,7 @@
               <w:rPr>
                 <w:sz w:val="19"/>
               </w:rPr>
+              <w:lastRenderedPageBreak/>
               <w:t>50% + 8</w:t>
             </w:r>
           </w:p>
@@ -4473,7 +4473,6 @@
         <w:rPr>
           <w:b/>
         </w:rPr>
-        <w:lastRenderedPageBreak/>
         <w:t>Modelling assumptions</w:t>
       </w:r>
       <w:r>
@@ -4489,7 +4488,7 @@
           <w:noProof/>
         </w:rPr>
         <w:drawing>
-          <wp:inline distT="0" distB="0" distL="0" distR="0" wp14:anchorId="28862092" wp14:editId="3C9C4719">
+          <wp:inline distT="0" distB="0" distL="0" distR="0" wp14:anchorId="733405A8" wp14:editId="2DC9EF06">
             <wp:extent cx="5760000" cy="5760000"/>
             <wp:effectExtent l="0" t="0" r="0" b="0"/>
             <wp:docPr id="4" name="Picture 4"/>
@@ -4541,7 +4540,7 @@
       <w:pPr>
         <w:pStyle w:val="Heading1"/>
       </w:pPr>
-      <w:bookmarkStart w:id="8" w:name="_Toc243606562"/>
+      <w:bookmarkStart w:id="8" w:name="_Toc243765041"/>
       <w:r>
         <w:t>8. Application Implementation</w:t>
       </w:r>
@@ -4696,6 +4695,7 @@
               <w:rPr>
                 <w:sz w:val="19"/>
               </w:rPr>
+              <w:lastRenderedPageBreak/>
               <w:t>API</w:t>
             </w:r>
           </w:p>
@@ -4730,14 +4730,7 @@
               <w:rPr>
                 <w:sz w:val="19"/>
               </w:rPr>
-              <w:t xml:space="preserve">REST endpoints, Cognito token checks, file or DynamoDB storage, </w:t>
-            </w:r>
-            <w:r>
-              <w:rPr>
-                <w:sz w:val="19"/>
-              </w:rPr>
-              <w:lastRenderedPageBreak/>
-              <w:t>CSV upload validation</w:t>
+              <w:t>REST endpoints, Cognito token checks, file or DynamoDB storage, CSV upload validation</w:t>
             </w:r>
           </w:p>
         </w:tc>
@@ -4758,7 +4751,6 @@
               <w:rPr>
                 <w:sz w:val="19"/>
               </w:rPr>
-              <w:lastRenderedPageBreak/>
               <w:t>Engine</w:t>
             </w:r>
           </w:p>
@@ -4818,7 +4810,7 @@
           <w:noProof/>
         </w:rPr>
         <w:drawing>
-          <wp:inline distT="0" distB="0" distL="0" distR="0" wp14:anchorId="52605D8D" wp14:editId="55F1D166">
+          <wp:inline distT="0" distB="0" distL="0" distR="0" wp14:anchorId="36E38FB9" wp14:editId="530D7E2E">
             <wp:extent cx="5760000" cy="4400000"/>
             <wp:effectExtent l="0" t="0" r="0" b="0"/>
             <wp:docPr id="5" name="Picture 5"/>
@@ -4940,7 +4932,7 @@
         </w:rPr>
         <w:lastRenderedPageBreak/>
         <w:drawing>
-          <wp:inline distT="0" distB="0" distL="0" distR="0" wp14:anchorId="38FB1477" wp14:editId="134CEDFA">
+          <wp:inline distT="0" distB="0" distL="0" distR="0" wp14:anchorId="47AE799C" wp14:editId="0B7C39C8">
             <wp:extent cx="5760000" cy="3600000"/>
             <wp:effectExtent l="0" t="0" r="0" b="0"/>
             <wp:docPr id="6" name="Picture 6"/>
@@ -4997,7 +4989,7 @@
           <w:noProof/>
         </w:rPr>
         <w:drawing>
-          <wp:inline distT="0" distB="0" distL="0" distR="0" wp14:anchorId="09525402" wp14:editId="366D8F71">
+          <wp:inline distT="0" distB="0" distL="0" distR="0" wp14:anchorId="37C1548B" wp14:editId="0ED53CC1">
             <wp:extent cx="5760000" cy="3600000"/>
             <wp:effectExtent l="0" t="0" r="0" b="0"/>
             <wp:docPr id="7" name="Picture 7"/>
@@ -5055,7 +5047,7 @@
         </w:rPr>
         <w:lastRenderedPageBreak/>
         <w:drawing>
-          <wp:inline distT="0" distB="0" distL="0" distR="0" wp14:anchorId="2424BD2A" wp14:editId="3079C94D">
+          <wp:inline distT="0" distB="0" distL="0" distR="0" wp14:anchorId="25886CF1" wp14:editId="7DC80F32">
             <wp:extent cx="5760000" cy="3600000"/>
             <wp:effectExtent l="0" t="0" r="0" b="0"/>
             <wp:docPr id="8" name="Picture 8"/>
@@ -5112,7 +5104,7 @@
           <w:noProof/>
         </w:rPr>
         <w:drawing>
-          <wp:inline distT="0" distB="0" distL="0" distR="0" wp14:anchorId="4B2C6F08" wp14:editId="02AC5A81">
+          <wp:inline distT="0" distB="0" distL="0" distR="0" wp14:anchorId="7EFBF376" wp14:editId="22B7F147">
             <wp:extent cx="5760000" cy="3600000"/>
             <wp:effectExtent l="0" t="0" r="0" b="0"/>
             <wp:docPr id="9" name="Picture 9"/>
@@ -5175,7 +5167,7 @@
       <w:pPr>
         <w:pStyle w:val="Heading1"/>
       </w:pPr>
-      <w:bookmarkStart w:id="9" w:name="_Toc243606563"/>
+      <w:bookmarkStart w:id="9" w:name="_Toc243765042"/>
       <w:r>
         <w:lastRenderedPageBreak/>
         <w:t>9. AWS Deployment Design</w:t>
@@ -5184,7 +5176,7 @@
     </w:p>
     <w:p>
       <w:r>
-        <w:t>AURA runs live on AWS in the Mumbai region (ap-south-1), entirely within the AWS free plan: the dashboard on S3, sign-in through Cognito, data in DynamoDB, and the API with the ML model on one EC2 server.</w:t>
+        <w:t>AURA runs live on AWS in the Mumbai region (ap-south-1), entirely within the AWS free plan: the dashboard on S3, sign-in through Cognito, data in DynamoDB, the API with the ML model on one EC2 server, and email alerts through a DynamoDB stream, Lambda and SNS, watched by CloudWatch alarms.</w:t>
       </w:r>
     </w:p>
     <w:tbl>
@@ -5365,7 +5357,7 @@
               <w:rPr>
                 <w:sz w:val="19"/>
               </w:rPr>
-              <w:t>Dashboard sign-in; admin-created users only, 10+ character passwords</w:t>
+              <w:t>Sign-in, self-service account creation and password reset, both verified by an emailed 6-digit code; 10+ character passwords</w:t>
             </w:r>
           </w:p>
         </w:tc>
@@ -5549,7 +5541,7 @@
               <w:rPr>
                 <w:sz w:val="19"/>
               </w:rPr>
-              <w:t>Security group</w:t>
+              <w:t>AWS Lambda</w:t>
             </w:r>
           </w:p>
         </w:tc>
@@ -5566,7 +5558,7 @@
               <w:rPr>
                 <w:sz w:val="19"/>
               </w:rPr>
-              <w:t>aura-sg</w:t>
+              <w:t>Function aura-alert-publisher (Node.js 22), triggered by the AURA table's stream</w:t>
             </w:r>
           </w:p>
         </w:tc>
@@ -5574,6 +5566,168 @@
           <w:tcPr>
             <w:tcW w:w="3137" w:type="dxa"/>
             <w:shd w:val="clear" w:color="auto" w:fill="EEF2FF"/>
+          </w:tcPr>
+          <w:p>
+            <w:pPr>
+              <w:spacing w:after="0"/>
+            </w:pPr>
+            <w:r>
+              <w:rPr>
+                <w:sz w:val="19"/>
+              </w:rPr>
+              <w:t>Turns each new warning or critical alert row into an SNS message</w:t>
+            </w:r>
+          </w:p>
+        </w:tc>
+      </w:tr>
+      <w:tr>
+        <w:trPr>
+          <w:jc w:val="center"/>
+        </w:trPr>
+        <w:tc>
+          <w:tcPr>
+            <w:tcW w:w="3137" w:type="dxa"/>
+          </w:tcPr>
+          <w:p>
+            <w:pPr>
+              <w:spacing w:after="0"/>
+            </w:pPr>
+            <w:r>
+              <w:rPr>
+                <w:sz w:val="19"/>
+              </w:rPr>
+              <w:t>Amazon SNS</w:t>
+            </w:r>
+          </w:p>
+        </w:tc>
+        <w:tc>
+          <w:tcPr>
+            <w:tcW w:w="3137" w:type="dxa"/>
+          </w:tcPr>
+          <w:p>
+            <w:pPr>
+              <w:spacing w:after="0"/>
+            </w:pPr>
+            <w:r>
+              <w:rPr>
+                <w:sz w:val="19"/>
+              </w:rPr>
+              <w:t>Topic aura-alerts with a confirmed email subscription</w:t>
+            </w:r>
+          </w:p>
+        </w:tc>
+        <w:tc>
+          <w:tcPr>
+            <w:tcW w:w="3137" w:type="dxa"/>
+          </w:tcPr>
+          <w:p>
+            <w:pPr>
+              <w:spacing w:after="0"/>
+            </w:pPr>
+            <w:r>
+              <w:rPr>
+                <w:sz w:val="19"/>
+              </w:rPr>
+              <w:t>Emails alerts to the facility manager</w:t>
+            </w:r>
+          </w:p>
+        </w:tc>
+      </w:tr>
+      <w:tr>
+        <w:trPr>
+          <w:jc w:val="center"/>
+        </w:trPr>
+        <w:tc>
+          <w:tcPr>
+            <w:tcW w:w="3137" w:type="dxa"/>
+            <w:shd w:val="clear" w:color="auto" w:fill="EEF2FF"/>
+          </w:tcPr>
+          <w:p>
+            <w:pPr>
+              <w:spacing w:after="0"/>
+            </w:pPr>
+            <w:r>
+              <w:rPr>
+                <w:sz w:val="19"/>
+              </w:rPr>
+              <w:t>Amazon CloudWatch</w:t>
+            </w:r>
+          </w:p>
+        </w:tc>
+        <w:tc>
+          <w:tcPr>
+            <w:tcW w:w="3137" w:type="dxa"/>
+            <w:shd w:val="clear" w:color="auto" w:fill="EEF2FF"/>
+          </w:tcPr>
+          <w:p>
+            <w:pPr>
+              <w:spacing w:after="0"/>
+            </w:pPr>
+            <w:r>
+              <w:rPr>
+                <w:sz w:val="19"/>
+              </w:rPr>
+              <w:t>Alarms aura-alert-publisher-errors, aura-ec2-high-cpu (&gt; 80% for 15 min), aura-ec2-status-check</w:t>
+            </w:r>
+          </w:p>
+        </w:tc>
+        <w:tc>
+          <w:tcPr>
+            <w:tcW w:w="3137" w:type="dxa"/>
+            <w:shd w:val="clear" w:color="auto" w:fill="EEF2FF"/>
+          </w:tcPr>
+          <w:p>
+            <w:pPr>
+              <w:spacing w:after="0"/>
+            </w:pPr>
+            <w:r>
+              <w:rPr>
+                <w:sz w:val="19"/>
+              </w:rPr>
+              <w:t>Notify SNS if the Lambda fails or the server is overloaded or unhealthy</w:t>
+            </w:r>
+          </w:p>
+        </w:tc>
+      </w:tr>
+      <w:tr>
+        <w:trPr>
+          <w:jc w:val="center"/>
+        </w:trPr>
+        <w:tc>
+          <w:tcPr>
+            <w:tcW w:w="3137" w:type="dxa"/>
+          </w:tcPr>
+          <w:p>
+            <w:pPr>
+              <w:spacing w:after="0"/>
+            </w:pPr>
+            <w:r>
+              <w:rPr>
+                <w:sz w:val="19"/>
+              </w:rPr>
+              <w:t>Security group</w:t>
+            </w:r>
+          </w:p>
+        </w:tc>
+        <w:tc>
+          <w:tcPr>
+            <w:tcW w:w="3137" w:type="dxa"/>
+          </w:tcPr>
+          <w:p>
+            <w:pPr>
+              <w:spacing w:after="0"/>
+            </w:pPr>
+            <w:r>
+              <w:rPr>
+                <w:sz w:val="19"/>
+              </w:rPr>
+              <w:t>aura-sg</w:t>
+            </w:r>
+          </w:p>
+        </w:tc>
+        <w:tc>
+          <w:tcPr>
+            <w:tcW w:w="3137" w:type="dxa"/>
           </w:tcPr>
           <w:p>
             <w:pPr>
@@ -5774,7 +5928,83 @@
               <w:rPr>
                 <w:sz w:val="19"/>
               </w:rPr>
-              <w:t>1 user, minimum password length 10, admin-created users only</w:t>
+              <w:t>self sign-up enabled, email verification, minimum password length 10</w:t>
+            </w:r>
+          </w:p>
+        </w:tc>
+      </w:tr>
+      <w:tr>
+        <w:trPr>
+          <w:jc w:val="center"/>
+        </w:trPr>
+        <w:tc>
+          <w:tcPr>
+            <w:tcW w:w="4706" w:type="dxa"/>
+            <w:shd w:val="clear" w:color="auto" w:fill="EEF2FF"/>
+          </w:tcPr>
+          <w:p>
+            <w:pPr>
+              <w:spacing w:after="0"/>
+            </w:pPr>
+            <w:r>
+              <w:rPr>
+                <w:sz w:val="19"/>
+              </w:rPr>
+              <w:t>Lambda aura-alert-publisher</w:t>
+            </w:r>
+          </w:p>
+        </w:tc>
+        <w:tc>
+          <w:tcPr>
+            <w:tcW w:w="4706" w:type="dxa"/>
+            <w:shd w:val="clear" w:color="auto" w:fill="EEF2FF"/>
+          </w:tcPr>
+          <w:p>
+            <w:pPr>
+              <w:spacing w:after="0"/>
+            </w:pPr>
+            <w:r>
+              <w:rPr>
+                <w:sz w:val="19"/>
+              </w:rPr>
+              <w:t>stream trigger Enabled; end-to-end test alert processed (last result OK) and delivered by email</w:t>
+            </w:r>
+          </w:p>
+        </w:tc>
+      </w:tr>
+      <w:tr>
+        <w:trPr>
+          <w:jc w:val="center"/>
+        </w:trPr>
+        <w:tc>
+          <w:tcPr>
+            <w:tcW w:w="4706" w:type="dxa"/>
+          </w:tcPr>
+          <w:p>
+            <w:pPr>
+              <w:spacing w:after="0"/>
+            </w:pPr>
+            <w:r>
+              <w:rPr>
+                <w:sz w:val="19"/>
+              </w:rPr>
+              <w:t>CloudWatch</w:t>
+            </w:r>
+          </w:p>
+        </w:tc>
+        <w:tc>
+          <w:tcPr>
+            <w:tcW w:w="4706" w:type="dxa"/>
+          </w:tcPr>
+          <w:p>
+            <w:pPr>
+              <w:spacing w:after="0"/>
+            </w:pPr>
+            <w:r>
+              <w:rPr>
+                <w:sz w:val="19"/>
+              </w:rPr>
+              <w:t>3 alarms created, all sending to SNS topic aura-alerts</w:t>
             </w:r>
           </w:p>
         </w:tc>
@@ -5830,7 +6060,7 @@
         </w:rPr>
         <w:lastRenderedPageBreak/>
         <w:drawing>
-          <wp:inline distT="0" distB="0" distL="0" distR="0" wp14:anchorId="2918BD1D" wp14:editId="351BC87F">
+          <wp:inline distT="0" distB="0" distL="0" distR="0" wp14:anchorId="05AFEA91" wp14:editId="48C671E0">
             <wp:extent cx="5760000" cy="3600000"/>
             <wp:effectExtent l="0" t="0" r="0" b="0"/>
             <wp:docPr id="10" name="Picture 10"/>
@@ -5875,7 +6105,18 @@
           <w:i/>
           <w:sz w:val="19"/>
         </w:rPr>
-        <w:t>Figure 10. The Cognito sign-in page, served live from the S3 website.</w:t>
+        <w:t>Figure 10. The Cognito sign-in page, served live from the S3 website, with Forgot password and Create an account options.</w:t>
+      </w:r>
+    </w:p>
+    <w:p>
+      <w:r>
+        <w:rPr>
+          <w:b/>
+        </w:rPr>
+        <w:t>Alert pipeline.</w:t>
+      </w:r>
+      <w:r>
+        <w:t xml:space="preserve"> When a new alert row is written to DynamoDB, the table's stream triggers the aura-alert-publisher Lambda. It ignores info-level alerts and publishes each warning or critical one to the SNS topic, which emails the subscribed facility manager. We tested this end to end by inserting a test alert and receiving the email. The deploy scripts are in src/aws/scripts/ (ec2-userdata.sh, deploy-services.sh, deploy-alerts.sh).</w:t>
       </w:r>
     </w:p>
     <w:p>
@@ -5886,7 +6127,7 @@
         <w:t>Designed but not yet deployed.</w:t>
       </w:r>
       <w:r>
-        <w:t xml:space="preserve"> The full design in Figure 2 also includes SNS email alerts with an alert-publisher Lambda, CloudWatch alarms, API Gateway, and SageMaker for scheduled retraining. Agrani's CloudFormation template (src/aws/aura-stack.yaml) already defines SNS, the Lambda and the alarm.</w:t>
+        <w:t xml:space="preserve"> API Gateway in front of the API, and SageMaker for scheduled retraining, remain future work.</w:t>
       </w:r>
     </w:p>
     <w:p>
@@ -5904,7 +6145,7 @@
       <w:pPr>
         <w:pStyle w:val="Heading1"/>
       </w:pPr>
-      <w:bookmarkStart w:id="10" w:name="_Toc243606564"/>
+      <w:bookmarkStart w:id="10" w:name="_Toc243765043"/>
       <w:r>
         <w:t>10. Testing and Quality Assurance</w:t>
       </w:r>
@@ -6168,6 +6409,7 @@
               <w:rPr>
                 <w:sz w:val="19"/>
               </w:rPr>
+              <w:lastRenderedPageBreak/>
               <w:t>End-to-end on AWS</w:t>
             </w:r>
           </w:p>
@@ -6214,7 +6456,6 @@
         <w:rPr>
           <w:b/>
         </w:rPr>
-        <w:lastRenderedPageBreak/>
         <w:t>Demo input built from real data.</w:t>
       </w:r>
       <w:r>
@@ -6591,7 +6832,7 @@
       <w:pPr>
         <w:pStyle w:val="Heading1"/>
       </w:pPr>
-      <w:bookmarkStart w:id="11" w:name="_Toc243606565"/>
+      <w:bookmarkStart w:id="11" w:name="_Toc243765044"/>
       <w:r>
         <w:t>11. Results and Discussion</w:t>
       </w:r>
@@ -7122,6 +7363,7 @@
         <w:rPr>
           <w:b/>
         </w:rPr>
+        <w:lastRenderedPageBreak/>
         <w:t>Forecasting matters most around holidays.</w:t>
       </w:r>
       <w:r>
@@ -7150,7 +7392,6 @@
         <w:rPr>
           <w:b/>
         </w:rPr>
-        <w:lastRenderedPageBreak/>
         <w:t>What surprised us:</w:t>
       </w:r>
       <w:r>
@@ -7166,7 +7407,7 @@
           <w:noProof/>
         </w:rPr>
         <w:drawing>
-          <wp:inline distT="0" distB="0" distL="0" distR="0" wp14:anchorId="05E77B25" wp14:editId="1C6BE71A">
+          <wp:inline distT="0" distB="0" distL="0" distR="0" wp14:anchorId="000B76DF" wp14:editId="52DBE9FB">
             <wp:extent cx="5760000" cy="3600000"/>
             <wp:effectExtent l="0" t="0" r="0" b="0"/>
             <wp:docPr id="11" name="Picture 11"/>
@@ -7218,7 +7459,7 @@
       <w:pPr>
         <w:pStyle w:val="Heading1"/>
       </w:pPr>
-      <w:bookmarkStart w:id="12" w:name="_Toc243606566"/>
+      <w:bookmarkStart w:id="12" w:name="_Toc243765045"/>
       <w:r>
         <w:t>12. Limitations and Future Work</w:t>
       </w:r>
@@ -7322,6 +7563,7 @@
         <w:pStyle w:val="ListNumber"/>
       </w:pPr>
       <w:r>
+        <w:lastRenderedPageBreak/>
         <w:t>Add HTTPS with CloudFront and a custom domain, and put the API behind API Gateway.</w:t>
       </w:r>
     </w:p>
@@ -7330,7 +7572,7 @@
         <w:pStyle w:val="ListNumber"/>
       </w:pPr>
       <w:r>
-        <w:t>Deploy SNS email alerts, CloudWatch alarms and scheduled SageMaker retraining from the CloudFormation design.</w:t>
+        <w:t>Add scheduled SageMaker retraining, and a CloudWatch dashboard alongside the existing alarms.</w:t>
       </w:r>
     </w:p>
     <w:p>
@@ -7345,9 +7587,8 @@
       <w:pPr>
         <w:pStyle w:val="Heading1"/>
       </w:pPr>
-      <w:bookmarkStart w:id="13" w:name="_Toc243606567"/>
-      <w:r>
-        <w:lastRenderedPageBreak/>
+      <w:bookmarkStart w:id="13" w:name="_Toc243765046"/>
+      <w:r>
         <w:t>13. Conclusion</w:t>
       </w:r>
       <w:bookmarkEnd w:id="13"/>
@@ -7374,7 +7615,7 @@
       <w:pPr>
         <w:pStyle w:val="Heading1"/>
       </w:pPr>
-      <w:bookmarkStart w:id="14" w:name="_Toc243606568"/>
+      <w:bookmarkStart w:id="14" w:name="_Toc243765047"/>
       <w:r>
         <w:t>Acknowledgements</w:t>
       </w:r>
@@ -7394,7 +7635,7 @@
       <w:pPr>
         <w:pStyle w:val="Heading1"/>
       </w:pPr>
-      <w:bookmarkStart w:id="15" w:name="_Toc243606569"/>
+      <w:bookmarkStart w:id="15" w:name="_Toc243765048"/>
       <w:r>
         <w:lastRenderedPageBreak/>
         <w:t>References</w:t>
@@ -7446,7 +7687,7 @@
         <w:pStyle w:val="ListNumber"/>
       </w:pPr>
       <w:r>
-        <w:t>Amazon Web Services, documentation for Amazon EC2, S3, Cognito, DynamoDB and IAM. https://docs.aws.amazon.com</w:t>
+        <w:t>Amazon Web Services, documentation for Amazon EC2, S3, Cognito, DynamoDB, IAM, Lambda, SNS and CloudWatch. https://docs.aws.amazon.com</w:t>
       </w:r>
     </w:p>
     <w:p>
@@ -7498,7 +7739,7 @@
       <w:pPr>
         <w:pStyle w:val="Heading1"/>
       </w:pPr>
-      <w:bookmarkStart w:id="16" w:name="_Toc243606570"/>
+      <w:bookmarkStart w:id="16" w:name="_Toc243765049"/>
       <w:r>
         <w:lastRenderedPageBreak/>
         <w:t>Appendix A. Running the Project</w:t>
@@ -7513,7 +7754,7 @@
         <w:t>Live (AWS):</w:t>
       </w:r>
       <w:r>
-        <w:t xml:space="preserve"> open the S3 dashboard URL and sign in with a Cognito user created by an admin.</w:t>
+        <w:t xml:space="preserve"> open the S3 dashboard URL, choose Create an account (or sign in), and verify your email with the 6-digit code.</w:t>
       </w:r>
     </w:p>
     <w:p>
@@ -7593,7 +7834,7 @@
       <w:pPr>
         <w:pStyle w:val="Heading1"/>
       </w:pPr>
-      <w:bookmarkStart w:id="17" w:name="_Toc243606571"/>
+      <w:bookmarkStart w:id="17" w:name="_Toc243765050"/>
       <w:r>
         <w:t>Appendix B. Configuration Reference</w:t>
       </w:r>
@@ -8300,7 +8541,7 @@
       <w:pPr>
         <w:pStyle w:val="Heading1"/>
       </w:pPr>
-      <w:bookmarkStart w:id="18" w:name="_Toc243606572"/>
+      <w:bookmarkStart w:id="18" w:name="_Toc243765051"/>
       <w:r>
         <w:t>Appendix C. Glossary</w:t>
       </w:r>
@@ -8736,6 +8977,43 @@
                 <w:sz w:val="19"/>
               </w:rPr>
               <w:t>AWS services for sign-in / NoSQL database / virtual servers / permissions / file and website storage</w:t>
+            </w:r>
+          </w:p>
+        </w:tc>
+      </w:tr>
+      <w:tr>
+        <w:trPr>
+          <w:jc w:val="center"/>
+        </w:trPr>
+        <w:tc>
+          <w:tcPr>
+            <w:tcW w:w="4706" w:type="dxa"/>
+          </w:tcPr>
+          <w:p>
+            <w:pPr>
+              <w:spacing w:after="0"/>
+            </w:pPr>
+            <w:r>
+              <w:rPr>
+                <w:sz w:val="19"/>
+              </w:rPr>
+              <w:t>Lambda / SNS / CloudWatch</w:t>
+            </w:r>
+          </w:p>
+        </w:tc>
+        <w:tc>
+          <w:tcPr>
+            <w:tcW w:w="4706" w:type="dxa"/>
+          </w:tcPr>
+          <w:p>
+            <w:pPr>
+              <w:spacing w:after="0"/>
+            </w:pPr>
+            <w:r>
+              <w:rPr>
+                <w:sz w:val="19"/>
+              </w:rPr>
+              <w:t>AWS services for event-driven functions / notifications and email / monitoring and alarms</w:t>
             </w:r>
           </w:p>
         </w:tc>
@@ -9006,31 +9284,31 @@
       </w:rPr>
     </w:lvl>
   </w:abstractNum>
-  <w:num w:numId="1" w16cid:durableId="395127960">
+  <w:num w:numId="1" w16cid:durableId="1248268861">
     <w:abstractNumId w:val="8"/>
   </w:num>
-  <w:num w:numId="2" w16cid:durableId="716708888">
+  <w:num w:numId="2" w16cid:durableId="1265959155">
     <w:abstractNumId w:val="6"/>
   </w:num>
-  <w:num w:numId="3" w16cid:durableId="1822847552">
+  <w:num w:numId="3" w16cid:durableId="1075711683">
     <w:abstractNumId w:val="5"/>
   </w:num>
-  <w:num w:numId="4" w16cid:durableId="1564875235">
+  <w:num w:numId="4" w16cid:durableId="321131070">
     <w:abstractNumId w:val="4"/>
   </w:num>
-  <w:num w:numId="5" w16cid:durableId="236012809">
+  <w:num w:numId="5" w16cid:durableId="367218703">
     <w:abstractNumId w:val="7"/>
   </w:num>
-  <w:num w:numId="6" w16cid:durableId="496918679">
+  <w:num w:numId="6" w16cid:durableId="1124419763">
     <w:abstractNumId w:val="3"/>
   </w:num>
-  <w:num w:numId="7" w16cid:durableId="731078141">
+  <w:num w:numId="7" w16cid:durableId="1637955976">
     <w:abstractNumId w:val="2"/>
   </w:num>
-  <w:num w:numId="8" w16cid:durableId="1721589880">
+  <w:num w:numId="8" w16cid:durableId="1019937433">
     <w:abstractNumId w:val="1"/>
   </w:num>
-  <w:num w:numId="9" w16cid:durableId="1363508560">
+  <w:num w:numId="9" w16cid:durableId="555312191">
     <w:abstractNumId w:val="0"/>
   </w:num>
 </w:numbering>
@@ -20420,7 +20698,7 @@
     <w:autoRedefine/>
     <w:uiPriority w:val="39"/>
     <w:unhideWhenUsed/>
-    <w:rsid w:val="0070148A"/>
+    <w:rsid w:val="005F37F8"/>
     <w:pPr>
       <w:spacing w:after="100"/>
     </w:pPr>
@@ -20430,7 +20708,7 @@
     <w:basedOn w:val="DefaultParagraphFont"/>
     <w:uiPriority w:val="99"/>
     <w:unhideWhenUsed/>
-    <w:rsid w:val="0070148A"/>
+    <w:rsid w:val="005F37F8"/>
     <w:rPr>
       <w:color w:val="0000FF" w:themeColor="hyperlink"/>
       <w:u w:val="single"/>

</xml_diff>